<commit_message>
Updated documentation: Added Front Pages PDF, cleaned up temporary files, removed merged versions. Project ready for submission.
</commit_message>
<xml_diff>
--- a/University_Management_System_Front_Pages.docx
+++ b/University_Management_System_Front_Pages.docx
@@ -2036,21 +2036,6 @@
       </w:r>
       <w:r>
         <w:rPr>
-          <w:spacing w:val="-10"/>
-          <w:sz w:val="24"/>
-          <w:szCs w:val="24"/>
-        </w:rPr>
-        <w:t xml:space="preserve"> </w:t>
-      </w:r>
-      <w:r>
-        <w:rPr>
-          <w:sz w:val="24"/>
-          <w:szCs w:val="24"/>
-        </w:rPr>
-        <w:t>for</w:t>
-      </w:r>
-      <w:r>
-        <w:rPr>
           <w:spacing w:val="-12"/>
           <w:sz w:val="24"/>
           <w:szCs w:val="24"/>
@@ -9893,7 +9878,6 @@
         <w:docPartUnique/>
       </w:docPartObj>
     </w:sdtPr>
-    <w:sdtEndPr/>
     <w:sdtContent>
       <w:p>
         <w:pPr>

</xml_diff>